<commit_message>
feat(templates): update nine document templates
</commit_message>
<xml_diff>
--- a/backend/templates/GSSG-GS_300-003_Acknowledgment_Form_.docx
+++ b/backend/templates/GSSG-GS_300-003_Acknowledgment_Form_.docx
@@ -64,44 +64,63 @@
             </w:pPr>
             <w:r>
               <w:rPr>
-                <w:rFonts w:ascii="Times New Roman"/>
                 <w:noProof/>
-                <w:sz w:val="20"/>
               </w:rPr>
               <w:drawing>
-                <wp:inline distT="0" distB="0" distL="0" distR="0" wp14:anchorId="58F87BF6" wp14:editId="4FB879B0">
-                  <wp:extent cx="896112" cy="896111"/>
+                <wp:anchor distT="0" distB="0" distL="114300" distR="114300" simplePos="0" relativeHeight="251657216" behindDoc="0" locked="0" layoutInCell="1" allowOverlap="1" wp14:anchorId="561F42AB" wp14:editId="280DCAB6">
+                  <wp:simplePos x="0" y="0"/>
+                  <wp:positionH relativeFrom="column">
+                    <wp:posOffset>8595</wp:posOffset>
+                  </wp:positionH>
+                  <wp:positionV relativeFrom="paragraph">
+                    <wp:posOffset>146050</wp:posOffset>
+                  </wp:positionV>
+                  <wp:extent cx="1790700" cy="596900"/>
                   <wp:effectExtent l="0" t="0" r="0" b="0"/>
-                  <wp:docPr id="1" name="Image 1"/>
+                  <wp:wrapNone/>
+                  <wp:docPr id="631907257" name="Picture 5"/>
                   <wp:cNvGraphicFramePr>
-                    <a:graphicFrameLocks xmlns:a="http://schemas.openxmlformats.org/drawingml/2006/main"/>
+                    <a:graphicFrameLocks xmlns:a="http://schemas.openxmlformats.org/drawingml/2006/main" noChangeAspect="1"/>
                   </wp:cNvGraphicFramePr>
                   <a:graphic xmlns:a="http://schemas.openxmlformats.org/drawingml/2006/main">
                     <a:graphicData uri="http://schemas.openxmlformats.org/drawingml/2006/picture">
                       <pic:pic xmlns:pic="http://schemas.openxmlformats.org/drawingml/2006/picture">
                         <pic:nvPicPr>
-                          <pic:cNvPr id="1" name="Image 1"/>
-                          <pic:cNvPicPr/>
+                          <pic:cNvPr id="0" name="Picture 1"/>
+                          <pic:cNvPicPr>
+                            <a:picLocks noChangeAspect="1" noChangeArrowheads="1"/>
+                          </pic:cNvPicPr>
                         </pic:nvPicPr>
                         <pic:blipFill>
-                          <a:blip r:embed="rId4" cstate="print"/>
+                          <a:blip r:embed="rId4" cstate="print">
+                            <a:extLst>
+                              <a:ext uri="{28A0092B-C50C-407E-A947-70E740481C1C}">
+                                <a14:useLocalDpi xmlns:a14="http://schemas.microsoft.com/office/drawing/2010/main" val="0"/>
+                              </a:ext>
+                            </a:extLst>
+                          </a:blip>
+                          <a:srcRect/>
                           <a:stretch>
                             <a:fillRect/>
                           </a:stretch>
                         </pic:blipFill>
-                        <pic:spPr>
+                        <pic:spPr bwMode="auto">
                           <a:xfrm>
                             <a:off x="0" y="0"/>
-                            <a:ext cx="896112" cy="896111"/>
+                            <a:ext cx="1790700" cy="596900"/>
                           </a:xfrm>
                           <a:prstGeom prst="rect">
                             <a:avLst/>
                           </a:prstGeom>
+                          <a:noFill/>
+                          <a:ln>
+                            <a:noFill/>
+                          </a:ln>
                         </pic:spPr>
                       </pic:pic>
                     </a:graphicData>
                   </a:graphic>
-                </wp:inline>
+                </wp:anchor>
               </w:drawing>
             </w:r>
             <w:r>
@@ -110,49 +129,6 @@
                 <w:sz w:val="20"/>
               </w:rPr>
               <w:tab/>
-            </w:r>
-            <w:r>
-              <w:rPr>
-                <w:rFonts w:ascii="Times New Roman"/>
-                <w:noProof/>
-                <w:position w:val="24"/>
-                <w:sz w:val="20"/>
-              </w:rPr>
-              <w:drawing>
-                <wp:inline distT="0" distB="0" distL="0" distR="0" wp14:anchorId="73212F4C" wp14:editId="5B20790F">
-                  <wp:extent cx="446251" cy="594359"/>
-                  <wp:effectExtent l="0" t="0" r="0" b="0"/>
-                  <wp:docPr id="2" name="Image 2"/>
-                  <wp:cNvGraphicFramePr>
-                    <a:graphicFrameLocks xmlns:a="http://schemas.openxmlformats.org/drawingml/2006/main"/>
-                  </wp:cNvGraphicFramePr>
-                  <a:graphic xmlns:a="http://schemas.openxmlformats.org/drawingml/2006/main">
-                    <a:graphicData uri="http://schemas.openxmlformats.org/drawingml/2006/picture">
-                      <pic:pic xmlns:pic="http://schemas.openxmlformats.org/drawingml/2006/picture">
-                        <pic:nvPicPr>
-                          <pic:cNvPr id="2" name="Image 2"/>
-                          <pic:cNvPicPr/>
-                        </pic:nvPicPr>
-                        <pic:blipFill>
-                          <a:blip r:embed="rId5" cstate="print"/>
-                          <a:stretch>
-                            <a:fillRect/>
-                          </a:stretch>
-                        </pic:blipFill>
-                        <pic:spPr>
-                          <a:xfrm>
-                            <a:off x="0" y="0"/>
-                            <a:ext cx="446251" cy="594359"/>
-                          </a:xfrm>
-                          <a:prstGeom prst="rect">
-                            <a:avLst/>
-                          </a:prstGeom>
-                        </pic:spPr>
-                      </pic:pic>
-                    </a:graphicData>
-                  </a:graphic>
-                </wp:inline>
-              </w:drawing>
             </w:r>
           </w:p>
         </w:tc>
@@ -754,7 +730,7 @@
                                   <w:sz w:val="16"/>
                                 </w:rPr>
                               </w:pPr>
-                              <w:hyperlink r:id="rId6">
+                              <w:hyperlink r:id="rId5">
                                 <w:r>
                                   <w:rPr>
                                     <w:b/>
@@ -1134,7 +1110,7 @@
                             <w:sz w:val="16"/>
                           </w:rPr>
                         </w:pPr>
-                        <w:hyperlink r:id="rId7">
+                        <w:hyperlink r:id="rId6">
                           <w:r>
                             <w:rPr>
                               <w:b/>
@@ -1567,6 +1543,8 @@
                 <w:sz w:val="17"/>
               </w:rPr>
             </w:pPr>
+            <w:proofErr w:type="spellStart"/>
+            <w:proofErr w:type="gramStart"/>
             <w:r>
               <w:rPr>
                 <w:b/>
@@ -1575,6 +1553,8 @@
               </w:rPr>
               <w:t>S.No</w:t>
             </w:r>
+            <w:proofErr w:type="spellEnd"/>
+            <w:proofErr w:type="gramEnd"/>
           </w:p>
         </w:tc>
         <w:tc>
@@ -1673,12 +1653,37 @@
                 <w:szCs w:val="32"/>
               </w:rPr>
             </w:pPr>
-            <w:r>
-              <w:rPr>
-                <w:color w:val="000000"/>
-                <w:sz w:val="20"/>
-              </w:rPr>
-              <w:t>{{ item(0, 'sno', '1') }}</w:t>
+            <w:proofErr w:type="gramStart"/>
+            <w:r>
+              <w:rPr>
+                <w:color w:val="000000"/>
+                <w:sz w:val="20"/>
+              </w:rPr>
+              <w:t>{{ item</w:t>
+            </w:r>
+            <w:proofErr w:type="gramEnd"/>
+            <w:r>
+              <w:rPr>
+                <w:color w:val="000000"/>
+                <w:sz w:val="20"/>
+              </w:rPr>
+              <w:t>(0, '</w:t>
+            </w:r>
+            <w:proofErr w:type="spellStart"/>
+            <w:r>
+              <w:rPr>
+                <w:color w:val="000000"/>
+                <w:sz w:val="20"/>
+              </w:rPr>
+              <w:t>sno</w:t>
+            </w:r>
+            <w:proofErr w:type="spellEnd"/>
+            <w:r>
+              <w:rPr>
+                <w:color w:val="000000"/>
+                <w:sz w:val="20"/>
+              </w:rPr>
+              <w:t>', '1') }}</w:t>
             </w:r>
           </w:p>
         </w:tc>
@@ -1699,12 +1704,21 @@
                 <w:szCs w:val="32"/>
               </w:rPr>
             </w:pPr>
-            <w:r>
-              <w:rPr>
-                <w:color w:val="000000"/>
-                <w:sz w:val="20"/>
-              </w:rPr>
-              <w:t>{{ item(0, 'description') }}</w:t>
+            <w:proofErr w:type="gramStart"/>
+            <w:r>
+              <w:rPr>
+                <w:color w:val="000000"/>
+                <w:sz w:val="20"/>
+              </w:rPr>
+              <w:t>{{ item</w:t>
+            </w:r>
+            <w:proofErr w:type="gramEnd"/>
+            <w:r>
+              <w:rPr>
+                <w:color w:val="000000"/>
+                <w:sz w:val="20"/>
+              </w:rPr>
+              <w:t>(0, 'description') }}</w:t>
             </w:r>
           </w:p>
         </w:tc>
@@ -1723,12 +1737,21 @@
                 <w:szCs w:val="32"/>
               </w:rPr>
             </w:pPr>
-            <w:r>
-              <w:rPr>
-                <w:color w:val="000000"/>
-                <w:sz w:val="20"/>
-              </w:rPr>
-              <w:t>{{ item(0, 'unit') }}</w:t>
+            <w:proofErr w:type="gramStart"/>
+            <w:r>
+              <w:rPr>
+                <w:color w:val="000000"/>
+                <w:sz w:val="20"/>
+              </w:rPr>
+              <w:t>{{ item</w:t>
+            </w:r>
+            <w:proofErr w:type="gramEnd"/>
+            <w:r>
+              <w:rPr>
+                <w:color w:val="000000"/>
+                <w:sz w:val="20"/>
+              </w:rPr>
+              <w:t>(0, 'unit') }}</w:t>
             </w:r>
           </w:p>
         </w:tc>
@@ -1747,12 +1770,21 @@
                 <w:szCs w:val="32"/>
               </w:rPr>
             </w:pPr>
-            <w:r>
-              <w:rPr>
-                <w:color w:val="000000"/>
-                <w:sz w:val="20"/>
-              </w:rPr>
-              <w:t>{{ item(0, 'quantity') }}</w:t>
+            <w:proofErr w:type="gramStart"/>
+            <w:r>
+              <w:rPr>
+                <w:color w:val="000000"/>
+                <w:sz w:val="20"/>
+              </w:rPr>
+              <w:t>{{ item</w:t>
+            </w:r>
+            <w:proofErr w:type="gramEnd"/>
+            <w:r>
+              <w:rPr>
+                <w:color w:val="000000"/>
+                <w:sz w:val="20"/>
+              </w:rPr>
+              <w:t>(0, 'quantity') }}</w:t>
             </w:r>
           </w:p>
         </w:tc>
@@ -1776,12 +1808,37 @@
                 <w:szCs w:val="32"/>
               </w:rPr>
             </w:pPr>
-            <w:r>
-              <w:rPr>
-                <w:color w:val="000000"/>
-                <w:sz w:val="20"/>
-              </w:rPr>
-              <w:t>{{ item(1, 'sno', '2') }}</w:t>
+            <w:proofErr w:type="gramStart"/>
+            <w:r>
+              <w:rPr>
+                <w:color w:val="000000"/>
+                <w:sz w:val="20"/>
+              </w:rPr>
+              <w:t>{{ item</w:t>
+            </w:r>
+            <w:proofErr w:type="gramEnd"/>
+            <w:r>
+              <w:rPr>
+                <w:color w:val="000000"/>
+                <w:sz w:val="20"/>
+              </w:rPr>
+              <w:t>(1, '</w:t>
+            </w:r>
+            <w:proofErr w:type="spellStart"/>
+            <w:r>
+              <w:rPr>
+                <w:color w:val="000000"/>
+                <w:sz w:val="20"/>
+              </w:rPr>
+              <w:t>sno</w:t>
+            </w:r>
+            <w:proofErr w:type="spellEnd"/>
+            <w:r>
+              <w:rPr>
+                <w:color w:val="000000"/>
+                <w:sz w:val="20"/>
+              </w:rPr>
+              <w:t>', '2') }}</w:t>
             </w:r>
           </w:p>
         </w:tc>
@@ -1802,12 +1859,21 @@
                 <w:szCs w:val="32"/>
               </w:rPr>
             </w:pPr>
-            <w:r>
-              <w:rPr>
-                <w:color w:val="000000"/>
-                <w:sz w:val="20"/>
-              </w:rPr>
-              <w:t>{{ item(1, 'description') }}</w:t>
+            <w:proofErr w:type="gramStart"/>
+            <w:r>
+              <w:rPr>
+                <w:color w:val="000000"/>
+                <w:sz w:val="20"/>
+              </w:rPr>
+              <w:t>{{ item</w:t>
+            </w:r>
+            <w:proofErr w:type="gramEnd"/>
+            <w:r>
+              <w:rPr>
+                <w:color w:val="000000"/>
+                <w:sz w:val="20"/>
+              </w:rPr>
+              <w:t>(1, 'description') }}</w:t>
             </w:r>
           </w:p>
         </w:tc>
@@ -1826,12 +1892,21 @@
                 <w:szCs w:val="32"/>
               </w:rPr>
             </w:pPr>
-            <w:r>
-              <w:rPr>
-                <w:color w:val="000000"/>
-                <w:sz w:val="20"/>
-              </w:rPr>
-              <w:t>{{ item(1, 'unit') }}</w:t>
+            <w:proofErr w:type="gramStart"/>
+            <w:r>
+              <w:rPr>
+                <w:color w:val="000000"/>
+                <w:sz w:val="20"/>
+              </w:rPr>
+              <w:t>{{ item</w:t>
+            </w:r>
+            <w:proofErr w:type="gramEnd"/>
+            <w:r>
+              <w:rPr>
+                <w:color w:val="000000"/>
+                <w:sz w:val="20"/>
+              </w:rPr>
+              <w:t>(1, 'unit') }}</w:t>
             </w:r>
           </w:p>
         </w:tc>
@@ -1850,12 +1925,21 @@
                 <w:szCs w:val="32"/>
               </w:rPr>
             </w:pPr>
-            <w:r>
-              <w:rPr>
-                <w:color w:val="000000"/>
-                <w:sz w:val="20"/>
-              </w:rPr>
-              <w:t>{{ item(1, 'quantity') }}</w:t>
+            <w:proofErr w:type="gramStart"/>
+            <w:r>
+              <w:rPr>
+                <w:color w:val="000000"/>
+                <w:sz w:val="20"/>
+              </w:rPr>
+              <w:t>{{ item</w:t>
+            </w:r>
+            <w:proofErr w:type="gramEnd"/>
+            <w:r>
+              <w:rPr>
+                <w:color w:val="000000"/>
+                <w:sz w:val="20"/>
+              </w:rPr>
+              <w:t>(1, 'quantity') }}</w:t>
             </w:r>
           </w:p>
         </w:tc>
@@ -1879,12 +1963,37 @@
                 <w:szCs w:val="32"/>
               </w:rPr>
             </w:pPr>
-            <w:r>
-              <w:rPr>
-                <w:color w:val="000000"/>
-                <w:sz w:val="20"/>
-              </w:rPr>
-              <w:t>{{ item(2, 'sno', '3') }}</w:t>
+            <w:proofErr w:type="gramStart"/>
+            <w:r>
+              <w:rPr>
+                <w:color w:val="000000"/>
+                <w:sz w:val="20"/>
+              </w:rPr>
+              <w:t>{{ item</w:t>
+            </w:r>
+            <w:proofErr w:type="gramEnd"/>
+            <w:r>
+              <w:rPr>
+                <w:color w:val="000000"/>
+                <w:sz w:val="20"/>
+              </w:rPr>
+              <w:t>(2, '</w:t>
+            </w:r>
+            <w:proofErr w:type="spellStart"/>
+            <w:r>
+              <w:rPr>
+                <w:color w:val="000000"/>
+                <w:sz w:val="20"/>
+              </w:rPr>
+              <w:t>sno</w:t>
+            </w:r>
+            <w:proofErr w:type="spellEnd"/>
+            <w:r>
+              <w:rPr>
+                <w:color w:val="000000"/>
+                <w:sz w:val="20"/>
+              </w:rPr>
+              <w:t>', '3') }}</w:t>
             </w:r>
           </w:p>
         </w:tc>
@@ -1905,12 +2014,21 @@
                 <w:szCs w:val="32"/>
               </w:rPr>
             </w:pPr>
-            <w:r>
-              <w:rPr>
-                <w:color w:val="000000"/>
-                <w:sz w:val="20"/>
-              </w:rPr>
-              <w:t>{{ item(2, 'description') }}</w:t>
+            <w:proofErr w:type="gramStart"/>
+            <w:r>
+              <w:rPr>
+                <w:color w:val="000000"/>
+                <w:sz w:val="20"/>
+              </w:rPr>
+              <w:t>{{ item</w:t>
+            </w:r>
+            <w:proofErr w:type="gramEnd"/>
+            <w:r>
+              <w:rPr>
+                <w:color w:val="000000"/>
+                <w:sz w:val="20"/>
+              </w:rPr>
+              <w:t>(2, 'description') }}</w:t>
             </w:r>
           </w:p>
         </w:tc>
@@ -1929,12 +2047,21 @@
                 <w:szCs w:val="32"/>
               </w:rPr>
             </w:pPr>
-            <w:r>
-              <w:rPr>
-                <w:color w:val="000000"/>
-                <w:sz w:val="20"/>
-              </w:rPr>
-              <w:t>{{ item(2, 'unit') }}</w:t>
+            <w:proofErr w:type="gramStart"/>
+            <w:r>
+              <w:rPr>
+                <w:color w:val="000000"/>
+                <w:sz w:val="20"/>
+              </w:rPr>
+              <w:t>{{ item</w:t>
+            </w:r>
+            <w:proofErr w:type="gramEnd"/>
+            <w:r>
+              <w:rPr>
+                <w:color w:val="000000"/>
+                <w:sz w:val="20"/>
+              </w:rPr>
+              <w:t>(2, 'unit') }}</w:t>
             </w:r>
           </w:p>
         </w:tc>
@@ -1953,12 +2080,21 @@
                 <w:szCs w:val="32"/>
               </w:rPr>
             </w:pPr>
-            <w:r>
-              <w:rPr>
-                <w:color w:val="000000"/>
-                <w:sz w:val="20"/>
-              </w:rPr>
-              <w:t>{{ item(2, 'quantity') }}</w:t>
+            <w:proofErr w:type="gramStart"/>
+            <w:r>
+              <w:rPr>
+                <w:color w:val="000000"/>
+                <w:sz w:val="20"/>
+              </w:rPr>
+              <w:t>{{ item</w:t>
+            </w:r>
+            <w:proofErr w:type="gramEnd"/>
+            <w:r>
+              <w:rPr>
+                <w:color w:val="000000"/>
+                <w:sz w:val="20"/>
+              </w:rPr>
+              <w:t>(2, 'quantity') }}</w:t>
             </w:r>
           </w:p>
         </w:tc>
@@ -1982,12 +2118,37 @@
                 <w:szCs w:val="32"/>
               </w:rPr>
             </w:pPr>
-            <w:r>
-              <w:rPr>
-                <w:color w:val="000000"/>
-                <w:sz w:val="20"/>
-              </w:rPr>
-              <w:t>{{ item(3, 'sno', '4') }}</w:t>
+            <w:proofErr w:type="gramStart"/>
+            <w:r>
+              <w:rPr>
+                <w:color w:val="000000"/>
+                <w:sz w:val="20"/>
+              </w:rPr>
+              <w:t>{{ item</w:t>
+            </w:r>
+            <w:proofErr w:type="gramEnd"/>
+            <w:r>
+              <w:rPr>
+                <w:color w:val="000000"/>
+                <w:sz w:val="20"/>
+              </w:rPr>
+              <w:t>(3, '</w:t>
+            </w:r>
+            <w:proofErr w:type="spellStart"/>
+            <w:r>
+              <w:rPr>
+                <w:color w:val="000000"/>
+                <w:sz w:val="20"/>
+              </w:rPr>
+              <w:t>sno</w:t>
+            </w:r>
+            <w:proofErr w:type="spellEnd"/>
+            <w:r>
+              <w:rPr>
+                <w:color w:val="000000"/>
+                <w:sz w:val="20"/>
+              </w:rPr>
+              <w:t>', '4') }}</w:t>
             </w:r>
           </w:p>
         </w:tc>
@@ -2008,12 +2169,21 @@
                 <w:szCs w:val="32"/>
               </w:rPr>
             </w:pPr>
-            <w:r>
-              <w:rPr>
-                <w:color w:val="000000"/>
-                <w:sz w:val="20"/>
-              </w:rPr>
-              <w:t>{{ item(3, 'description') }}</w:t>
+            <w:proofErr w:type="gramStart"/>
+            <w:r>
+              <w:rPr>
+                <w:color w:val="000000"/>
+                <w:sz w:val="20"/>
+              </w:rPr>
+              <w:t>{{ item</w:t>
+            </w:r>
+            <w:proofErr w:type="gramEnd"/>
+            <w:r>
+              <w:rPr>
+                <w:color w:val="000000"/>
+                <w:sz w:val="20"/>
+              </w:rPr>
+              <w:t>(3, 'description') }}</w:t>
             </w:r>
           </w:p>
         </w:tc>
@@ -2032,12 +2202,21 @@
                 <w:szCs w:val="32"/>
               </w:rPr>
             </w:pPr>
-            <w:r>
-              <w:rPr>
-                <w:color w:val="000000"/>
-                <w:sz w:val="20"/>
-              </w:rPr>
-              <w:t>{{ item(3, 'unit') }}</w:t>
+            <w:proofErr w:type="gramStart"/>
+            <w:r>
+              <w:rPr>
+                <w:color w:val="000000"/>
+                <w:sz w:val="20"/>
+              </w:rPr>
+              <w:t>{{ item</w:t>
+            </w:r>
+            <w:proofErr w:type="gramEnd"/>
+            <w:r>
+              <w:rPr>
+                <w:color w:val="000000"/>
+                <w:sz w:val="20"/>
+              </w:rPr>
+              <w:t>(3, 'unit') }}</w:t>
             </w:r>
           </w:p>
         </w:tc>
@@ -2056,12 +2235,21 @@
                 <w:szCs w:val="32"/>
               </w:rPr>
             </w:pPr>
-            <w:r>
-              <w:rPr>
-                <w:color w:val="000000"/>
-                <w:sz w:val="20"/>
-              </w:rPr>
-              <w:t>{{ item(3, 'quantity') }}</w:t>
+            <w:proofErr w:type="gramStart"/>
+            <w:r>
+              <w:rPr>
+                <w:color w:val="000000"/>
+                <w:sz w:val="20"/>
+              </w:rPr>
+              <w:t>{{ item</w:t>
+            </w:r>
+            <w:proofErr w:type="gramEnd"/>
+            <w:r>
+              <w:rPr>
+                <w:color w:val="000000"/>
+                <w:sz w:val="20"/>
+              </w:rPr>
+              <w:t>(3, 'quantity') }}</w:t>
             </w:r>
           </w:p>
         </w:tc>
@@ -2085,12 +2273,37 @@
                 <w:szCs w:val="32"/>
               </w:rPr>
             </w:pPr>
-            <w:r>
-              <w:rPr>
-                <w:color w:val="000000"/>
-                <w:sz w:val="20"/>
-              </w:rPr>
-              <w:t>{{ item(4, 'sno', '5') }}</w:t>
+            <w:proofErr w:type="gramStart"/>
+            <w:r>
+              <w:rPr>
+                <w:color w:val="000000"/>
+                <w:sz w:val="20"/>
+              </w:rPr>
+              <w:t>{{ item</w:t>
+            </w:r>
+            <w:proofErr w:type="gramEnd"/>
+            <w:r>
+              <w:rPr>
+                <w:color w:val="000000"/>
+                <w:sz w:val="20"/>
+              </w:rPr>
+              <w:t>(4, '</w:t>
+            </w:r>
+            <w:proofErr w:type="spellStart"/>
+            <w:r>
+              <w:rPr>
+                <w:color w:val="000000"/>
+                <w:sz w:val="20"/>
+              </w:rPr>
+              <w:t>sno</w:t>
+            </w:r>
+            <w:proofErr w:type="spellEnd"/>
+            <w:r>
+              <w:rPr>
+                <w:color w:val="000000"/>
+                <w:sz w:val="20"/>
+              </w:rPr>
+              <w:t>', '5') }}</w:t>
             </w:r>
           </w:p>
         </w:tc>
@@ -2111,12 +2324,21 @@
                 <w:szCs w:val="32"/>
               </w:rPr>
             </w:pPr>
-            <w:r>
-              <w:rPr>
-                <w:color w:val="000000"/>
-                <w:sz w:val="20"/>
-              </w:rPr>
-              <w:t>{{ item(4, 'description') }}</w:t>
+            <w:proofErr w:type="gramStart"/>
+            <w:r>
+              <w:rPr>
+                <w:color w:val="000000"/>
+                <w:sz w:val="20"/>
+              </w:rPr>
+              <w:t>{{ item</w:t>
+            </w:r>
+            <w:proofErr w:type="gramEnd"/>
+            <w:r>
+              <w:rPr>
+                <w:color w:val="000000"/>
+                <w:sz w:val="20"/>
+              </w:rPr>
+              <w:t>(4, 'description') }}</w:t>
             </w:r>
           </w:p>
         </w:tc>
@@ -2135,12 +2357,21 @@
                 <w:szCs w:val="32"/>
               </w:rPr>
             </w:pPr>
-            <w:r>
-              <w:rPr>
-                <w:color w:val="000000"/>
-                <w:sz w:val="20"/>
-              </w:rPr>
-              <w:t>{{ item(4, 'unit') }}</w:t>
+            <w:proofErr w:type="gramStart"/>
+            <w:r>
+              <w:rPr>
+                <w:color w:val="000000"/>
+                <w:sz w:val="20"/>
+              </w:rPr>
+              <w:t>{{ item</w:t>
+            </w:r>
+            <w:proofErr w:type="gramEnd"/>
+            <w:r>
+              <w:rPr>
+                <w:color w:val="000000"/>
+                <w:sz w:val="20"/>
+              </w:rPr>
+              <w:t>(4, 'unit') }}</w:t>
             </w:r>
           </w:p>
         </w:tc>
@@ -2159,12 +2390,21 @@
                 <w:szCs w:val="32"/>
               </w:rPr>
             </w:pPr>
-            <w:r>
-              <w:rPr>
-                <w:color w:val="000000"/>
-                <w:sz w:val="20"/>
-              </w:rPr>
-              <w:t>{{ item(4, 'quantity') }}</w:t>
+            <w:proofErr w:type="gramStart"/>
+            <w:r>
+              <w:rPr>
+                <w:color w:val="000000"/>
+                <w:sz w:val="20"/>
+              </w:rPr>
+              <w:t>{{ item</w:t>
+            </w:r>
+            <w:proofErr w:type="gramEnd"/>
+            <w:r>
+              <w:rPr>
+                <w:color w:val="000000"/>
+                <w:sz w:val="20"/>
+              </w:rPr>
+              <w:t>(4, 'quantity') }}</w:t>
             </w:r>
           </w:p>
         </w:tc>
@@ -2188,12 +2428,37 @@
                 <w:szCs w:val="32"/>
               </w:rPr>
             </w:pPr>
-            <w:r>
-              <w:rPr>
-                <w:color w:val="000000"/>
-                <w:sz w:val="20"/>
-              </w:rPr>
-              <w:t>{{ item(5, 'sno', '6') }}</w:t>
+            <w:proofErr w:type="gramStart"/>
+            <w:r>
+              <w:rPr>
+                <w:color w:val="000000"/>
+                <w:sz w:val="20"/>
+              </w:rPr>
+              <w:t>{{ item</w:t>
+            </w:r>
+            <w:proofErr w:type="gramEnd"/>
+            <w:r>
+              <w:rPr>
+                <w:color w:val="000000"/>
+                <w:sz w:val="20"/>
+              </w:rPr>
+              <w:t>(5, '</w:t>
+            </w:r>
+            <w:proofErr w:type="spellStart"/>
+            <w:r>
+              <w:rPr>
+                <w:color w:val="000000"/>
+                <w:sz w:val="20"/>
+              </w:rPr>
+              <w:t>sno</w:t>
+            </w:r>
+            <w:proofErr w:type="spellEnd"/>
+            <w:r>
+              <w:rPr>
+                <w:color w:val="000000"/>
+                <w:sz w:val="20"/>
+              </w:rPr>
+              <w:t>', '6') }}</w:t>
             </w:r>
           </w:p>
         </w:tc>
@@ -2214,12 +2479,21 @@
                 <w:szCs w:val="32"/>
               </w:rPr>
             </w:pPr>
-            <w:r>
-              <w:rPr>
-                <w:color w:val="000000"/>
-                <w:sz w:val="20"/>
-              </w:rPr>
-              <w:t>{{ item(5, 'description') }}</w:t>
+            <w:proofErr w:type="gramStart"/>
+            <w:r>
+              <w:rPr>
+                <w:color w:val="000000"/>
+                <w:sz w:val="20"/>
+              </w:rPr>
+              <w:t>{{ item</w:t>
+            </w:r>
+            <w:proofErr w:type="gramEnd"/>
+            <w:r>
+              <w:rPr>
+                <w:color w:val="000000"/>
+                <w:sz w:val="20"/>
+              </w:rPr>
+              <w:t>(5, 'description') }}</w:t>
             </w:r>
           </w:p>
         </w:tc>
@@ -2238,12 +2512,21 @@
                 <w:szCs w:val="32"/>
               </w:rPr>
             </w:pPr>
-            <w:r>
-              <w:rPr>
-                <w:color w:val="000000"/>
-                <w:sz w:val="20"/>
-              </w:rPr>
-              <w:t>{{ item(5, 'unit') }}</w:t>
+            <w:proofErr w:type="gramStart"/>
+            <w:r>
+              <w:rPr>
+                <w:color w:val="000000"/>
+                <w:sz w:val="20"/>
+              </w:rPr>
+              <w:t>{{ item</w:t>
+            </w:r>
+            <w:proofErr w:type="gramEnd"/>
+            <w:r>
+              <w:rPr>
+                <w:color w:val="000000"/>
+                <w:sz w:val="20"/>
+              </w:rPr>
+              <w:t>(5, 'unit') }}</w:t>
             </w:r>
           </w:p>
         </w:tc>
@@ -2262,12 +2545,21 @@
                 <w:szCs w:val="32"/>
               </w:rPr>
             </w:pPr>
-            <w:r>
-              <w:rPr>
-                <w:color w:val="000000"/>
-                <w:sz w:val="20"/>
-              </w:rPr>
-              <w:t>{{ item(5, 'quantity') }}</w:t>
+            <w:proofErr w:type="gramStart"/>
+            <w:r>
+              <w:rPr>
+                <w:color w:val="000000"/>
+                <w:sz w:val="20"/>
+              </w:rPr>
+              <w:t>{{ item</w:t>
+            </w:r>
+            <w:proofErr w:type="gramEnd"/>
+            <w:r>
+              <w:rPr>
+                <w:color w:val="000000"/>
+                <w:sz w:val="20"/>
+              </w:rPr>
+              <w:t>(5, 'quantity') }}</w:t>
             </w:r>
           </w:p>
         </w:tc>
@@ -2291,12 +2583,37 @@
                 <w:szCs w:val="32"/>
               </w:rPr>
             </w:pPr>
-            <w:r>
-              <w:rPr>
-                <w:color w:val="000000"/>
-                <w:sz w:val="20"/>
-              </w:rPr>
-              <w:t>{{ item(6, 'sno', '7') }}</w:t>
+            <w:proofErr w:type="gramStart"/>
+            <w:r>
+              <w:rPr>
+                <w:color w:val="000000"/>
+                <w:sz w:val="20"/>
+              </w:rPr>
+              <w:t>{{ item</w:t>
+            </w:r>
+            <w:proofErr w:type="gramEnd"/>
+            <w:r>
+              <w:rPr>
+                <w:color w:val="000000"/>
+                <w:sz w:val="20"/>
+              </w:rPr>
+              <w:t>(6, '</w:t>
+            </w:r>
+            <w:proofErr w:type="spellStart"/>
+            <w:r>
+              <w:rPr>
+                <w:color w:val="000000"/>
+                <w:sz w:val="20"/>
+              </w:rPr>
+              <w:t>sno</w:t>
+            </w:r>
+            <w:proofErr w:type="spellEnd"/>
+            <w:r>
+              <w:rPr>
+                <w:color w:val="000000"/>
+                <w:sz w:val="20"/>
+              </w:rPr>
+              <w:t>', '7') }}</w:t>
             </w:r>
           </w:p>
         </w:tc>
@@ -2317,12 +2634,21 @@
                 <w:szCs w:val="32"/>
               </w:rPr>
             </w:pPr>
-            <w:r>
-              <w:rPr>
-                <w:color w:val="000000"/>
-                <w:sz w:val="20"/>
-              </w:rPr>
-              <w:t>{{ item(6, 'description') }}</w:t>
+            <w:proofErr w:type="gramStart"/>
+            <w:r>
+              <w:rPr>
+                <w:color w:val="000000"/>
+                <w:sz w:val="20"/>
+              </w:rPr>
+              <w:t>{{ item</w:t>
+            </w:r>
+            <w:proofErr w:type="gramEnd"/>
+            <w:r>
+              <w:rPr>
+                <w:color w:val="000000"/>
+                <w:sz w:val="20"/>
+              </w:rPr>
+              <w:t>(6, 'description') }}</w:t>
             </w:r>
           </w:p>
         </w:tc>
@@ -2341,12 +2667,21 @@
                 <w:szCs w:val="32"/>
               </w:rPr>
             </w:pPr>
-            <w:r>
-              <w:rPr>
-                <w:color w:val="000000"/>
-                <w:sz w:val="20"/>
-              </w:rPr>
-              <w:t>{{ item(6, 'unit') }}</w:t>
+            <w:proofErr w:type="gramStart"/>
+            <w:r>
+              <w:rPr>
+                <w:color w:val="000000"/>
+                <w:sz w:val="20"/>
+              </w:rPr>
+              <w:t>{{ item</w:t>
+            </w:r>
+            <w:proofErr w:type="gramEnd"/>
+            <w:r>
+              <w:rPr>
+                <w:color w:val="000000"/>
+                <w:sz w:val="20"/>
+              </w:rPr>
+              <w:t>(6, 'unit') }}</w:t>
             </w:r>
           </w:p>
         </w:tc>
@@ -2365,12 +2700,21 @@
                 <w:szCs w:val="32"/>
               </w:rPr>
             </w:pPr>
-            <w:r>
-              <w:rPr>
-                <w:color w:val="000000"/>
-                <w:sz w:val="20"/>
-              </w:rPr>
-              <w:t>{{ item(6, 'quantity') }}</w:t>
+            <w:proofErr w:type="gramStart"/>
+            <w:r>
+              <w:rPr>
+                <w:color w:val="000000"/>
+                <w:sz w:val="20"/>
+              </w:rPr>
+              <w:t>{{ item</w:t>
+            </w:r>
+            <w:proofErr w:type="gramEnd"/>
+            <w:r>
+              <w:rPr>
+                <w:color w:val="000000"/>
+                <w:sz w:val="20"/>
+              </w:rPr>
+              <w:t>(6, 'quantity') }}</w:t>
             </w:r>
           </w:p>
         </w:tc>
@@ -2394,12 +2738,37 @@
                 <w:szCs w:val="32"/>
               </w:rPr>
             </w:pPr>
-            <w:r>
-              <w:rPr>
-                <w:color w:val="000000"/>
-                <w:sz w:val="20"/>
-              </w:rPr>
-              <w:t>{{ item(7, 'sno', '8') }}</w:t>
+            <w:proofErr w:type="gramStart"/>
+            <w:r>
+              <w:rPr>
+                <w:color w:val="000000"/>
+                <w:sz w:val="20"/>
+              </w:rPr>
+              <w:t>{{ item</w:t>
+            </w:r>
+            <w:proofErr w:type="gramEnd"/>
+            <w:r>
+              <w:rPr>
+                <w:color w:val="000000"/>
+                <w:sz w:val="20"/>
+              </w:rPr>
+              <w:t>(7, '</w:t>
+            </w:r>
+            <w:proofErr w:type="spellStart"/>
+            <w:r>
+              <w:rPr>
+                <w:color w:val="000000"/>
+                <w:sz w:val="20"/>
+              </w:rPr>
+              <w:t>sno</w:t>
+            </w:r>
+            <w:proofErr w:type="spellEnd"/>
+            <w:r>
+              <w:rPr>
+                <w:color w:val="000000"/>
+                <w:sz w:val="20"/>
+              </w:rPr>
+              <w:t>', '8') }}</w:t>
             </w:r>
           </w:p>
         </w:tc>
@@ -2420,12 +2789,21 @@
                 <w:szCs w:val="32"/>
               </w:rPr>
             </w:pPr>
-            <w:r>
-              <w:rPr>
-                <w:color w:val="000000"/>
-                <w:sz w:val="20"/>
-              </w:rPr>
-              <w:t>{{ item(7, 'description') }}</w:t>
+            <w:proofErr w:type="gramStart"/>
+            <w:r>
+              <w:rPr>
+                <w:color w:val="000000"/>
+                <w:sz w:val="20"/>
+              </w:rPr>
+              <w:t>{{ item</w:t>
+            </w:r>
+            <w:proofErr w:type="gramEnd"/>
+            <w:r>
+              <w:rPr>
+                <w:color w:val="000000"/>
+                <w:sz w:val="20"/>
+              </w:rPr>
+              <w:t>(7, 'description') }}</w:t>
             </w:r>
           </w:p>
         </w:tc>
@@ -2444,12 +2822,21 @@
                 <w:szCs w:val="32"/>
               </w:rPr>
             </w:pPr>
-            <w:r>
-              <w:rPr>
-                <w:color w:val="000000"/>
-                <w:sz w:val="20"/>
-              </w:rPr>
-              <w:t>{{ item(7, 'unit') }}</w:t>
+            <w:proofErr w:type="gramStart"/>
+            <w:r>
+              <w:rPr>
+                <w:color w:val="000000"/>
+                <w:sz w:val="20"/>
+              </w:rPr>
+              <w:t>{{ item</w:t>
+            </w:r>
+            <w:proofErr w:type="gramEnd"/>
+            <w:r>
+              <w:rPr>
+                <w:color w:val="000000"/>
+                <w:sz w:val="20"/>
+              </w:rPr>
+              <w:t>(7, 'unit') }}</w:t>
             </w:r>
           </w:p>
         </w:tc>
@@ -2468,12 +2855,21 @@
                 <w:szCs w:val="32"/>
               </w:rPr>
             </w:pPr>
-            <w:r>
-              <w:rPr>
-                <w:color w:val="000000"/>
-                <w:sz w:val="20"/>
-              </w:rPr>
-              <w:t>{{ item(7, 'quantity') }}</w:t>
+            <w:proofErr w:type="gramStart"/>
+            <w:r>
+              <w:rPr>
+                <w:color w:val="000000"/>
+                <w:sz w:val="20"/>
+              </w:rPr>
+              <w:t>{{ item</w:t>
+            </w:r>
+            <w:proofErr w:type="gramEnd"/>
+            <w:r>
+              <w:rPr>
+                <w:color w:val="000000"/>
+                <w:sz w:val="20"/>
+              </w:rPr>
+              <w:t>(7, 'quantity') }}</w:t>
             </w:r>
           </w:p>
         </w:tc>
@@ -2497,12 +2893,37 @@
                 <w:szCs w:val="32"/>
               </w:rPr>
             </w:pPr>
-            <w:r>
-              <w:rPr>
-                <w:color w:val="000000"/>
-                <w:sz w:val="20"/>
-              </w:rPr>
-              <w:t>{{ item(8, 'sno', '9') }}</w:t>
+            <w:proofErr w:type="gramStart"/>
+            <w:r>
+              <w:rPr>
+                <w:color w:val="000000"/>
+                <w:sz w:val="20"/>
+              </w:rPr>
+              <w:t>{{ item</w:t>
+            </w:r>
+            <w:proofErr w:type="gramEnd"/>
+            <w:r>
+              <w:rPr>
+                <w:color w:val="000000"/>
+                <w:sz w:val="20"/>
+              </w:rPr>
+              <w:t>(8, '</w:t>
+            </w:r>
+            <w:proofErr w:type="spellStart"/>
+            <w:r>
+              <w:rPr>
+                <w:color w:val="000000"/>
+                <w:sz w:val="20"/>
+              </w:rPr>
+              <w:t>sno</w:t>
+            </w:r>
+            <w:proofErr w:type="spellEnd"/>
+            <w:r>
+              <w:rPr>
+                <w:color w:val="000000"/>
+                <w:sz w:val="20"/>
+              </w:rPr>
+              <w:t>', '9') }}</w:t>
             </w:r>
           </w:p>
         </w:tc>
@@ -2523,12 +2944,21 @@
                 <w:szCs w:val="32"/>
               </w:rPr>
             </w:pPr>
-            <w:r>
-              <w:rPr>
-                <w:color w:val="000000"/>
-                <w:sz w:val="20"/>
-              </w:rPr>
-              <w:t>{{ item(8, 'description') }}</w:t>
+            <w:proofErr w:type="gramStart"/>
+            <w:r>
+              <w:rPr>
+                <w:color w:val="000000"/>
+                <w:sz w:val="20"/>
+              </w:rPr>
+              <w:t>{{ item</w:t>
+            </w:r>
+            <w:proofErr w:type="gramEnd"/>
+            <w:r>
+              <w:rPr>
+                <w:color w:val="000000"/>
+                <w:sz w:val="20"/>
+              </w:rPr>
+              <w:t>(8, 'description') }}</w:t>
             </w:r>
           </w:p>
         </w:tc>
@@ -2547,12 +2977,21 @@
                 <w:szCs w:val="32"/>
               </w:rPr>
             </w:pPr>
-            <w:r>
-              <w:rPr>
-                <w:color w:val="000000"/>
-                <w:sz w:val="20"/>
-              </w:rPr>
-              <w:t>{{ item(8, 'unit') }}</w:t>
+            <w:proofErr w:type="gramStart"/>
+            <w:r>
+              <w:rPr>
+                <w:color w:val="000000"/>
+                <w:sz w:val="20"/>
+              </w:rPr>
+              <w:t>{{ item</w:t>
+            </w:r>
+            <w:proofErr w:type="gramEnd"/>
+            <w:r>
+              <w:rPr>
+                <w:color w:val="000000"/>
+                <w:sz w:val="20"/>
+              </w:rPr>
+              <w:t>(8, 'unit') }}</w:t>
             </w:r>
           </w:p>
         </w:tc>
@@ -2571,12 +3010,21 @@
                 <w:szCs w:val="32"/>
               </w:rPr>
             </w:pPr>
-            <w:r>
-              <w:rPr>
-                <w:color w:val="000000"/>
-                <w:sz w:val="20"/>
-              </w:rPr>
-              <w:t>{{ item(8, 'quantity') }}</w:t>
+            <w:proofErr w:type="gramStart"/>
+            <w:r>
+              <w:rPr>
+                <w:color w:val="000000"/>
+                <w:sz w:val="20"/>
+              </w:rPr>
+              <w:t>{{ item</w:t>
+            </w:r>
+            <w:proofErr w:type="gramEnd"/>
+            <w:r>
+              <w:rPr>
+                <w:color w:val="000000"/>
+                <w:sz w:val="20"/>
+              </w:rPr>
+              <w:t>(8, 'quantity') }}</w:t>
             </w:r>
           </w:p>
         </w:tc>
@@ -2600,12 +3048,37 @@
                 <w:szCs w:val="32"/>
               </w:rPr>
             </w:pPr>
-            <w:r>
-              <w:rPr>
-                <w:color w:val="000000"/>
-                <w:sz w:val="20"/>
-              </w:rPr>
-              <w:t>{{ item(9, 'sno', '10') }}</w:t>
+            <w:proofErr w:type="gramStart"/>
+            <w:r>
+              <w:rPr>
+                <w:color w:val="000000"/>
+                <w:sz w:val="20"/>
+              </w:rPr>
+              <w:t>{{ item</w:t>
+            </w:r>
+            <w:proofErr w:type="gramEnd"/>
+            <w:r>
+              <w:rPr>
+                <w:color w:val="000000"/>
+                <w:sz w:val="20"/>
+              </w:rPr>
+              <w:t>(9, '</w:t>
+            </w:r>
+            <w:proofErr w:type="spellStart"/>
+            <w:r>
+              <w:rPr>
+                <w:color w:val="000000"/>
+                <w:sz w:val="20"/>
+              </w:rPr>
+              <w:t>sno</w:t>
+            </w:r>
+            <w:proofErr w:type="spellEnd"/>
+            <w:r>
+              <w:rPr>
+                <w:color w:val="000000"/>
+                <w:sz w:val="20"/>
+              </w:rPr>
+              <w:t>', '10') }}</w:t>
             </w:r>
           </w:p>
         </w:tc>
@@ -2626,12 +3099,21 @@
                 <w:szCs w:val="32"/>
               </w:rPr>
             </w:pPr>
-            <w:r>
-              <w:rPr>
-                <w:color w:val="000000"/>
-                <w:sz w:val="20"/>
-              </w:rPr>
-              <w:t>{{ item(9, 'description') }}</w:t>
+            <w:proofErr w:type="gramStart"/>
+            <w:r>
+              <w:rPr>
+                <w:color w:val="000000"/>
+                <w:sz w:val="20"/>
+              </w:rPr>
+              <w:t>{{ item</w:t>
+            </w:r>
+            <w:proofErr w:type="gramEnd"/>
+            <w:r>
+              <w:rPr>
+                <w:color w:val="000000"/>
+                <w:sz w:val="20"/>
+              </w:rPr>
+              <w:t>(9, 'description') }}</w:t>
             </w:r>
           </w:p>
         </w:tc>
@@ -2650,12 +3132,21 @@
                 <w:szCs w:val="32"/>
               </w:rPr>
             </w:pPr>
-            <w:r>
-              <w:rPr>
-                <w:color w:val="000000"/>
-                <w:sz w:val="20"/>
-              </w:rPr>
-              <w:t>{{ item(9, 'unit') }}</w:t>
+            <w:proofErr w:type="gramStart"/>
+            <w:r>
+              <w:rPr>
+                <w:color w:val="000000"/>
+                <w:sz w:val="20"/>
+              </w:rPr>
+              <w:t>{{ item</w:t>
+            </w:r>
+            <w:proofErr w:type="gramEnd"/>
+            <w:r>
+              <w:rPr>
+                <w:color w:val="000000"/>
+                <w:sz w:val="20"/>
+              </w:rPr>
+              <w:t>(9, 'unit') }}</w:t>
             </w:r>
           </w:p>
         </w:tc>
@@ -2674,12 +3165,21 @@
                 <w:szCs w:val="32"/>
               </w:rPr>
             </w:pPr>
-            <w:r>
-              <w:rPr>
-                <w:color w:val="000000"/>
-                <w:sz w:val="20"/>
-              </w:rPr>
-              <w:t>{{ item(9, 'quantity') }}</w:t>
+            <w:proofErr w:type="gramStart"/>
+            <w:r>
+              <w:rPr>
+                <w:color w:val="000000"/>
+                <w:sz w:val="20"/>
+              </w:rPr>
+              <w:t>{{ item</w:t>
+            </w:r>
+            <w:proofErr w:type="gramEnd"/>
+            <w:r>
+              <w:rPr>
+                <w:color w:val="000000"/>
+                <w:sz w:val="20"/>
+              </w:rPr>
+              <w:t>(9, 'quantity') }}</w:t>
             </w:r>
           </w:p>
         </w:tc>
@@ -2703,12 +3203,37 @@
                 <w:szCs w:val="32"/>
               </w:rPr>
             </w:pPr>
-            <w:r>
-              <w:rPr>
-                <w:color w:val="000000"/>
-                <w:sz w:val="20"/>
-              </w:rPr>
-              <w:t>{{ item(10, 'sno', '11') }}</w:t>
+            <w:proofErr w:type="gramStart"/>
+            <w:r>
+              <w:rPr>
+                <w:color w:val="000000"/>
+                <w:sz w:val="20"/>
+              </w:rPr>
+              <w:t>{{ item</w:t>
+            </w:r>
+            <w:proofErr w:type="gramEnd"/>
+            <w:r>
+              <w:rPr>
+                <w:color w:val="000000"/>
+                <w:sz w:val="20"/>
+              </w:rPr>
+              <w:t>(10, '</w:t>
+            </w:r>
+            <w:proofErr w:type="spellStart"/>
+            <w:r>
+              <w:rPr>
+                <w:color w:val="000000"/>
+                <w:sz w:val="20"/>
+              </w:rPr>
+              <w:t>sno</w:t>
+            </w:r>
+            <w:proofErr w:type="spellEnd"/>
+            <w:r>
+              <w:rPr>
+                <w:color w:val="000000"/>
+                <w:sz w:val="20"/>
+              </w:rPr>
+              <w:t>', '11') }}</w:t>
             </w:r>
           </w:p>
         </w:tc>
@@ -2729,12 +3254,21 @@
                 <w:szCs w:val="32"/>
               </w:rPr>
             </w:pPr>
-            <w:r>
-              <w:rPr>
-                <w:color w:val="000000"/>
-                <w:sz w:val="20"/>
-              </w:rPr>
-              <w:t>{{ item(10, 'description') }}</w:t>
+            <w:proofErr w:type="gramStart"/>
+            <w:r>
+              <w:rPr>
+                <w:color w:val="000000"/>
+                <w:sz w:val="20"/>
+              </w:rPr>
+              <w:t>{{ item</w:t>
+            </w:r>
+            <w:proofErr w:type="gramEnd"/>
+            <w:r>
+              <w:rPr>
+                <w:color w:val="000000"/>
+                <w:sz w:val="20"/>
+              </w:rPr>
+              <w:t>(10, 'description') }}</w:t>
             </w:r>
           </w:p>
         </w:tc>
@@ -2753,12 +3287,21 @@
                 <w:szCs w:val="32"/>
               </w:rPr>
             </w:pPr>
-            <w:r>
-              <w:rPr>
-                <w:color w:val="000000"/>
-                <w:sz w:val="20"/>
-              </w:rPr>
-              <w:t>{{ item(10, 'unit') }}</w:t>
+            <w:proofErr w:type="gramStart"/>
+            <w:r>
+              <w:rPr>
+                <w:color w:val="000000"/>
+                <w:sz w:val="20"/>
+              </w:rPr>
+              <w:t>{{ item</w:t>
+            </w:r>
+            <w:proofErr w:type="gramEnd"/>
+            <w:r>
+              <w:rPr>
+                <w:color w:val="000000"/>
+                <w:sz w:val="20"/>
+              </w:rPr>
+              <w:t>(10, 'unit') }}</w:t>
             </w:r>
           </w:p>
         </w:tc>
@@ -2777,12 +3320,21 @@
                 <w:szCs w:val="32"/>
               </w:rPr>
             </w:pPr>
-            <w:r>
-              <w:rPr>
-                <w:color w:val="000000"/>
-                <w:sz w:val="20"/>
-              </w:rPr>
-              <w:t>{{ item(10, 'quantity') }}</w:t>
+            <w:proofErr w:type="gramStart"/>
+            <w:r>
+              <w:rPr>
+                <w:color w:val="000000"/>
+                <w:sz w:val="20"/>
+              </w:rPr>
+              <w:t>{{ item</w:t>
+            </w:r>
+            <w:proofErr w:type="gramEnd"/>
+            <w:r>
+              <w:rPr>
+                <w:color w:val="000000"/>
+                <w:sz w:val="20"/>
+              </w:rPr>
+              <w:t>(10, 'quantity') }}</w:t>
             </w:r>
           </w:p>
         </w:tc>
@@ -2806,12 +3358,37 @@
                 <w:szCs w:val="32"/>
               </w:rPr>
             </w:pPr>
-            <w:r>
-              <w:rPr>
-                <w:color w:val="000000"/>
-                <w:sz w:val="20"/>
-              </w:rPr>
-              <w:t>{{ item(11, 'sno', '12') }}</w:t>
+            <w:proofErr w:type="gramStart"/>
+            <w:r>
+              <w:rPr>
+                <w:color w:val="000000"/>
+                <w:sz w:val="20"/>
+              </w:rPr>
+              <w:t>{{ item</w:t>
+            </w:r>
+            <w:proofErr w:type="gramEnd"/>
+            <w:r>
+              <w:rPr>
+                <w:color w:val="000000"/>
+                <w:sz w:val="20"/>
+              </w:rPr>
+              <w:t>(11, '</w:t>
+            </w:r>
+            <w:proofErr w:type="spellStart"/>
+            <w:r>
+              <w:rPr>
+                <w:color w:val="000000"/>
+                <w:sz w:val="20"/>
+              </w:rPr>
+              <w:t>sno</w:t>
+            </w:r>
+            <w:proofErr w:type="spellEnd"/>
+            <w:r>
+              <w:rPr>
+                <w:color w:val="000000"/>
+                <w:sz w:val="20"/>
+              </w:rPr>
+              <w:t>', '12') }}</w:t>
             </w:r>
           </w:p>
         </w:tc>
@@ -2832,12 +3409,21 @@
                 <w:szCs w:val="32"/>
               </w:rPr>
             </w:pPr>
-            <w:r>
-              <w:rPr>
-                <w:color w:val="000000"/>
-                <w:sz w:val="20"/>
-              </w:rPr>
-              <w:t>{{ item(11, 'description') }}</w:t>
+            <w:proofErr w:type="gramStart"/>
+            <w:r>
+              <w:rPr>
+                <w:color w:val="000000"/>
+                <w:sz w:val="20"/>
+              </w:rPr>
+              <w:t>{{ item</w:t>
+            </w:r>
+            <w:proofErr w:type="gramEnd"/>
+            <w:r>
+              <w:rPr>
+                <w:color w:val="000000"/>
+                <w:sz w:val="20"/>
+              </w:rPr>
+              <w:t>(11, 'description') }}</w:t>
             </w:r>
           </w:p>
         </w:tc>
@@ -2856,12 +3442,21 @@
                 <w:szCs w:val="32"/>
               </w:rPr>
             </w:pPr>
-            <w:r>
-              <w:rPr>
-                <w:color w:val="000000"/>
-                <w:sz w:val="20"/>
-              </w:rPr>
-              <w:t>{{ item(11, 'unit') }}</w:t>
+            <w:proofErr w:type="gramStart"/>
+            <w:r>
+              <w:rPr>
+                <w:color w:val="000000"/>
+                <w:sz w:val="20"/>
+              </w:rPr>
+              <w:t>{{ item</w:t>
+            </w:r>
+            <w:proofErr w:type="gramEnd"/>
+            <w:r>
+              <w:rPr>
+                <w:color w:val="000000"/>
+                <w:sz w:val="20"/>
+              </w:rPr>
+              <w:t>(11, 'unit') }}</w:t>
             </w:r>
           </w:p>
         </w:tc>
@@ -2880,12 +3475,21 @@
                 <w:szCs w:val="32"/>
               </w:rPr>
             </w:pPr>
-            <w:r>
-              <w:rPr>
-                <w:color w:val="000000"/>
-                <w:sz w:val="20"/>
-              </w:rPr>
-              <w:t>{{ item(11, 'quantity') }}</w:t>
+            <w:proofErr w:type="gramStart"/>
+            <w:r>
+              <w:rPr>
+                <w:color w:val="000000"/>
+                <w:sz w:val="20"/>
+              </w:rPr>
+              <w:t>{{ item</w:t>
+            </w:r>
+            <w:proofErr w:type="gramEnd"/>
+            <w:r>
+              <w:rPr>
+                <w:color w:val="000000"/>
+                <w:sz w:val="20"/>
+              </w:rPr>
+              <w:t>(11, 'quantity') }}</w:t>
             </w:r>
           </w:p>
         </w:tc>
@@ -3190,12 +3794,21 @@
                 <w:szCs w:val="32"/>
               </w:rPr>
             </w:pPr>
-            <w:r>
-              <w:rPr>
-                <w:color w:val="000000"/>
-                <w:sz w:val="20"/>
-              </w:rPr>
-              <w:t>{{ name }}</w:t>
+            <w:proofErr w:type="gramStart"/>
+            <w:r>
+              <w:rPr>
+                <w:color w:val="000000"/>
+                <w:sz w:val="20"/>
+              </w:rPr>
+              <w:t>{{ name</w:t>
+            </w:r>
+            <w:proofErr w:type="gramEnd"/>
+            <w:r>
+              <w:rPr>
+                <w:color w:val="000000"/>
+                <w:sz w:val="20"/>
+              </w:rPr>
+              <w:t xml:space="preserve"> }}</w:t>
             </w:r>
           </w:p>
         </w:tc>
@@ -3260,12 +3873,37 @@
                 <w:szCs w:val="32"/>
               </w:rPr>
             </w:pPr>
-            <w:r>
-              <w:rPr>
-                <w:color w:val="000000"/>
-                <w:sz w:val="20"/>
-              </w:rPr>
-              <w:t>{{ employee_id }}</w:t>
+            <w:proofErr w:type="gramStart"/>
+            <w:r>
+              <w:rPr>
+                <w:color w:val="000000"/>
+                <w:sz w:val="20"/>
+              </w:rPr>
+              <w:t xml:space="preserve">{{ </w:t>
+            </w:r>
+            <w:proofErr w:type="spellStart"/>
+            <w:r>
+              <w:rPr>
+                <w:color w:val="000000"/>
+                <w:sz w:val="20"/>
+              </w:rPr>
+              <w:t>employee</w:t>
+            </w:r>
+            <w:proofErr w:type="gramEnd"/>
+            <w:r>
+              <w:rPr>
+                <w:color w:val="000000"/>
+                <w:sz w:val="20"/>
+              </w:rPr>
+              <w:t>_id</w:t>
+            </w:r>
+            <w:proofErr w:type="spellEnd"/>
+            <w:r>
+              <w:rPr>
+                <w:color w:val="000000"/>
+                <w:sz w:val="20"/>
+              </w:rPr>
+              <w:t xml:space="preserve"> }}</w:t>
             </w:r>
           </w:p>
         </w:tc>
@@ -3315,12 +3953,21 @@
                 <w:szCs w:val="32"/>
               </w:rPr>
             </w:pPr>
-            <w:r>
-              <w:rPr>
-                <w:color w:val="000000"/>
-                <w:sz w:val="20"/>
-              </w:rPr>
-              <w:t>{{ department }}</w:t>
+            <w:proofErr w:type="gramStart"/>
+            <w:r>
+              <w:rPr>
+                <w:color w:val="000000"/>
+                <w:sz w:val="20"/>
+              </w:rPr>
+              <w:t>{{ department</w:t>
+            </w:r>
+            <w:proofErr w:type="gramEnd"/>
+            <w:r>
+              <w:rPr>
+                <w:color w:val="000000"/>
+                <w:sz w:val="20"/>
+              </w:rPr>
+              <w:t xml:space="preserve"> }}</w:t>
             </w:r>
           </w:p>
         </w:tc>
@@ -3370,12 +4017,21 @@
                 <w:szCs w:val="32"/>
               </w:rPr>
             </w:pPr>
-            <w:r>
-              <w:rPr>
-                <w:color w:val="000000"/>
-                <w:sz w:val="20"/>
-              </w:rPr>
-              <w:t>{{ position }}</w:t>
+            <w:proofErr w:type="gramStart"/>
+            <w:r>
+              <w:rPr>
+                <w:color w:val="000000"/>
+                <w:sz w:val="20"/>
+              </w:rPr>
+              <w:t>{{ position</w:t>
+            </w:r>
+            <w:proofErr w:type="gramEnd"/>
+            <w:r>
+              <w:rPr>
+                <w:color w:val="000000"/>
+                <w:sz w:val="20"/>
+              </w:rPr>
+              <w:t xml:space="preserve"> }}</w:t>
             </w:r>
           </w:p>
         </w:tc>
@@ -3425,12 +4081,21 @@
                 <w:szCs w:val="32"/>
               </w:rPr>
             </w:pPr>
-            <w:r>
-              <w:rPr>
-                <w:color w:val="000000"/>
-                <w:sz w:val="20"/>
-              </w:rPr>
-              <w:t>{{ location }}</w:t>
+            <w:proofErr w:type="gramStart"/>
+            <w:r>
+              <w:rPr>
+                <w:color w:val="000000"/>
+                <w:sz w:val="20"/>
+              </w:rPr>
+              <w:t>{{ location</w:t>
+            </w:r>
+            <w:proofErr w:type="gramEnd"/>
+            <w:r>
+              <w:rPr>
+                <w:color w:val="000000"/>
+                <w:sz w:val="20"/>
+              </w:rPr>
+              <w:t xml:space="preserve"> }}</w:t>
             </w:r>
           </w:p>
         </w:tc>
@@ -3479,13 +4144,41 @@
                 <w:szCs w:val="32"/>
               </w:rPr>
             </w:pPr>
-            <w:r>
-              <w:rPr>
-                <w:rFonts w:asciiTheme="minorHAnsi" w:hAnsiTheme="minorHAnsi" w:cstheme="minorHAnsi"/>
-                <w:sz w:val="24"/>
-                <w:szCs w:val="32"/>
-              </w:rPr>
-              <w:t>{{ employee_sig }}</w:t>
+            <w:proofErr w:type="gramStart"/>
+            <w:r>
+              <w:rPr>
+                <w:rFonts w:asciiTheme="minorHAnsi" w:hAnsiTheme="minorHAnsi" w:cstheme="minorHAnsi"/>
+                <w:sz w:val="24"/>
+                <w:szCs w:val="32"/>
+              </w:rPr>
+              <w:t xml:space="preserve">{{ </w:t>
+            </w:r>
+            <w:proofErr w:type="spellStart"/>
+            <w:r>
+              <w:rPr>
+                <w:rFonts w:asciiTheme="minorHAnsi" w:hAnsiTheme="minorHAnsi" w:cstheme="minorHAnsi"/>
+                <w:sz w:val="24"/>
+                <w:szCs w:val="32"/>
+              </w:rPr>
+              <w:t>employee</w:t>
+            </w:r>
+            <w:proofErr w:type="gramEnd"/>
+            <w:r>
+              <w:rPr>
+                <w:rFonts w:asciiTheme="minorHAnsi" w:hAnsiTheme="minorHAnsi" w:cstheme="minorHAnsi"/>
+                <w:sz w:val="24"/>
+                <w:szCs w:val="32"/>
+              </w:rPr>
+              <w:t>_sig</w:t>
+            </w:r>
+            <w:proofErr w:type="spellEnd"/>
+            <w:r>
+              <w:rPr>
+                <w:rFonts w:asciiTheme="minorHAnsi" w:hAnsiTheme="minorHAnsi" w:cstheme="minorHAnsi"/>
+                <w:sz w:val="24"/>
+                <w:szCs w:val="32"/>
+              </w:rPr>
+              <w:t xml:space="preserve"> }}</w:t>
             </w:r>
           </w:p>
         </w:tc>
@@ -3534,12 +4227,21 @@
                 <w:szCs w:val="32"/>
               </w:rPr>
             </w:pPr>
-            <w:r>
-              <w:rPr>
-                <w:color w:val="000000"/>
-                <w:sz w:val="20"/>
-              </w:rPr>
-              <w:t>{{ date }}</w:t>
+            <w:proofErr w:type="gramStart"/>
+            <w:r>
+              <w:rPr>
+                <w:color w:val="000000"/>
+                <w:sz w:val="20"/>
+              </w:rPr>
+              <w:t>{{ date</w:t>
+            </w:r>
+            <w:proofErr w:type="gramEnd"/>
+            <w:r>
+              <w:rPr>
+                <w:color w:val="000000"/>
+                <w:sz w:val="20"/>
+              </w:rPr>
+              <w:t xml:space="preserve"> }}</w:t>
             </w:r>
           </w:p>
         </w:tc>

</xml_diff>